<commit_message>
feat: update company client care letters
</commit_message>
<xml_diff>
--- a/templates/client-care-letter-template.docx
+++ b/templates/client-care-letter-template.docx
@@ -146,10 +146,10 @@
       </w:pPr>
       <w:r>
         <w:rPr>
-          <w:sz w:val="24"/>
-          <w:lang w:val="en-GB"/>
-        </w:rPr>
-        <w:t xml:space="preserve">It is essential that you disclose all matters relating to your case to me. This will enable me to advise you properly on your application.  Any information given to us by you will be treated in the strictest confidence.  However, as part of the monitoring of our activities by the OISC, we are subject to regular audits of our work.  As part of this audit process, the OISC will require access to our files and records.  We are sure that you will recognise that the OISC has been put in place to protect the interests of both us and you, our clients. I would be grateful if you could sign one copy and return it to us. </w:t>
+          <w:rFonts w:ascii="Times New Roman" w:hAnsi="Times New Roman"/>
+          <w:sz w:val="24"/>
+        </w:rPr>
+        <w:t>It is essential that you disclose all matters relating to your case to me. This will enable me to advise you properly on your application. Any information given to us by you will be treated in the strictest confidence. However, as part of the monitoring of our activities by the Immigration Advice Authority (IAA), we are subject to regular audits of our work. As part of this audit process, the IAA will require access to our files and records. We are sure that you will recognise that the IAA has been put in place to protect the interests of both us and you, our clients. I would be grateful if you could sign one copy and return it to us.</w:t>
       </w:r>
     </w:p>
     <w:p>
@@ -248,56 +248,184 @@
       </w:pPr>
       <w:r>
         <w:rPr>
+          <w:rFonts w:ascii="Times New Roman" w:hAnsi="Times New Roman"/>
+          <w:sz w:val="24"/>
+        </w:rPr>
+        <w:t>I accept the terms and conditions as stated above. I understand that the Immigration Advice Authority (IAA) may wish to view case files handled by my adviser and give my permission for Leo Visa Service Limited to allow such access.</w:t>
+      </w:r>
+    </w:p>
+    <w:p>
+      <w:pPr>
+        <w:rPr>
           <w:sz w:val="24"/>
           <w:lang w:val="en-GB"/>
         </w:rPr>
-        <w:t xml:space="preserve">I accept the terms and conditions as stated above. I understand that the Office of the Immigration Services Commissioner may wish to view case files handled by my advisor and give my permission for </w:t>
-      </w:r>
-      <w:r>
-        <w:rPr>
-          <w:b/>
-          <w:sz w:val="24"/>
+      </w:pPr>
+    </w:p>
+    <w:p>
+      <w:pPr>
+        <w:rPr>
+          <w:sz w:val="24"/>
+          <w:lang w:val="en-GB"/>
+        </w:rPr>
+      </w:pPr>
+    </w:p>
+    <w:p>
+      <w:pPr>
+        <w:rPr>
+          <w:sz w:val="24"/>
+          <w:lang w:val="en-GB"/>
+        </w:rPr>
+      </w:pPr>
+    </w:p>
+    <w:p>
+      <w:pPr>
+        <w:rPr>
+          <w:sz w:val="24"/>
+          <w:lang w:val="en-GB"/>
+        </w:rPr>
+      </w:pPr>
+      <w:r>
+        <w:rPr>
+          <w:b/>
+          <w:bCs/>
+          <w:sz w:val="24"/>
+          <w:lang w:val="en-GB"/>
+        </w:rPr>
+        <w:t>Signed_________________</w:t>
+      </w:r>
+      <w:r>
+        <w:rPr>
+          <w:b/>
+          <w:bCs/>
+          <w:sz w:val="24"/>
+          <w:lang w:val="en-GB"/>
+        </w:rPr>
+        <w:t xml:space="preserve">; Print </w:t>
+      </w:r>
+      <w:proofErr w:type="gramStart"/>
+      <w:r>
+        <w:rPr>
+          <w:b/>
+          <w:bCs/>
+          <w:sz w:val="24"/>
+          <w:lang w:val="en-GB"/>
+        </w:rPr>
+        <w:t>Name</w:t>
+      </w:r>
+      <w:r>
+        <w:rPr>
+          <w:b/>
+          <w:bCs/>
+          <w:sz w:val="24"/>
+          <w:lang w:val="en-GB"/>
+        </w:rPr>
+        <w:t>:</w:t>
+      </w:r>
+      <w:r>
+        <w:rPr>
+          <w:b/>
+          <w:bCs/>
+          <w:color w:val="000000" w:themeColor="text1"/>
           <w:u w:val="single"/>
         </w:rPr>
-        <w:t xml:space="preserve">Leo </w:t>
+        <w:t>{</w:t>
+      </w:r>
+      <w:proofErr w:type="spellStart"/>
+      <w:r>
+        <w:rPr>
+          <w:b/>
+          <w:bCs/>
+          <w:color w:val="000000" w:themeColor="text1"/>
+          <w:u w:val="single"/>
+        </w:rPr>
+        <w:t>ClientName</w:t>
+      </w:r>
+      <w:proofErr w:type="spellEnd"/>
+      <w:r>
+        <w:rPr>
+          <w:b/>
+          <w:bCs/>
+          <w:color w:val="000000" w:themeColor="text1"/>
+          <w:u w:val="single"/>
+        </w:rPr>
+        <w:t>}</w:t>
       </w:r>
       <w:r>
         <w:rPr>
           <w:rFonts w:hint="eastAsia"/>
-          <w:b/>
-          <w:sz w:val="24"/>
-          <w:u w:val="single"/>
-        </w:rPr>
-        <w:t>V</w:t>
-      </w:r>
-      <w:r>
-        <w:rPr>
-          <w:b/>
-          <w:sz w:val="24"/>
-          <w:u w:val="single"/>
-        </w:rPr>
-        <w:t>isa Service</w:t>
-      </w:r>
-      <w:r>
-        <w:rPr>
-          <w:b/>
+          <w:sz w:val="24"/>
+          <w:lang w:val="en-GB"/>
+        </w:rPr>
+        <w:t xml:space="preserve">  </w:t>
+      </w:r>
+      <w:r>
+        <w:rPr>
+          <w:b/>
+          <w:bCs/>
+          <w:sz w:val="24"/>
+          <w:lang w:val="en-GB"/>
+        </w:rPr>
+        <w:t>Date</w:t>
+      </w:r>
+      <w:proofErr w:type="gramEnd"/>
+      <w:r>
+        <w:rPr>
+          <w:rFonts w:hint="eastAsia"/>
+          <w:b/>
+          <w:bCs/>
+          <w:sz w:val="24"/>
+          <w:lang w:val="en-GB"/>
+        </w:rPr>
+        <w:t>:</w:t>
+      </w:r>
+      <w:r>
+        <w:rPr>
+          <w:rFonts w:hint="eastAsia"/>
+          <w:b/>
+          <w:bCs/>
+          <w:sz w:val="24"/>
+          <w:lang w:val="en-GB"/>
+        </w:rPr>
+        <w:t xml:space="preserve"> </w:t>
+      </w:r>
+      <w:r>
+        <w:rPr>
+          <w:b/>
+          <w:bCs/>
           <w:sz w:val="24"/>
           <w:u w:val="single"/>
           <w:lang w:val="en-GB"/>
         </w:rPr>
-        <w:t xml:space="preserve"> Limited </w:t>
-      </w:r>
-      <w:r>
-        <w:rPr>
+        <w:t>{Date}</w:t>
+      </w:r>
+    </w:p>
+    <w:p>
+      <w:pPr>
+        <w:autoSpaceDE w:val="0"/>
+        <w:autoSpaceDN w:val="0"/>
+        <w:adjustRightInd w:val="0"/>
+        <w:rPr>
+          <w:b/>
+          <w:bCs/>
+          <w:color w:val="323299"/>
+          <w:kern w:val="0"/>
           <w:sz w:val="24"/>
           <w:lang w:val="en-GB"/>
         </w:rPr>
-        <w:t>to allow such access.</w:t>
-      </w:r>
-    </w:p>
-    <w:p>
-      <w:pPr>
-        <w:rPr>
+      </w:pPr>
+    </w:p>
+    <w:p>
+      <w:pPr>
+        <w:autoSpaceDE w:val="0"/>
+        <w:autoSpaceDN w:val="0"/>
+        <w:adjustRightInd w:val="0"/>
+        <w:ind w:firstLineChars="1500" w:firstLine="3614"/>
+        <w:rPr>
+          <w:b/>
+          <w:bCs/>
+          <w:color w:val="323299"/>
+          <w:kern w:val="0"/>
           <w:sz w:val="24"/>
           <w:lang w:val="en-GB"/>
         </w:rPr>
@@ -305,7 +433,15 @@
     </w:p>
     <w:p>
       <w:pPr>
-        <w:rPr>
+        <w:autoSpaceDE w:val="0"/>
+        <w:autoSpaceDN w:val="0"/>
+        <w:adjustRightInd w:val="0"/>
+        <w:ind w:firstLineChars="1500" w:firstLine="3614"/>
+        <w:rPr>
+          <w:b/>
+          <w:bCs/>
+          <w:color w:val="323299"/>
+          <w:kern w:val="0"/>
           <w:sz w:val="24"/>
           <w:lang w:val="en-GB"/>
         </w:rPr>
@@ -313,7 +449,15 @@
     </w:p>
     <w:p>
       <w:pPr>
-        <w:rPr>
+        <w:autoSpaceDE w:val="0"/>
+        <w:autoSpaceDN w:val="0"/>
+        <w:adjustRightInd w:val="0"/>
+        <w:ind w:firstLineChars="1500" w:firstLine="3614"/>
+        <w:rPr>
+          <w:b/>
+          <w:bCs/>
+          <w:color w:val="323299"/>
+          <w:kern w:val="0"/>
           <w:sz w:val="24"/>
           <w:lang w:val="en-GB"/>
         </w:rPr>
@@ -321,47 +465,445 @@
     </w:p>
     <w:p>
       <w:pPr>
-        <w:rPr>
-          <w:sz w:val="24"/>
+        <w:autoSpaceDE w:val="0"/>
+        <w:autoSpaceDN w:val="0"/>
+        <w:adjustRightInd w:val="0"/>
+        <w:ind w:firstLineChars="1500" w:firstLine="3614"/>
+        <w:rPr>
+          <w:b/>
+          <w:bCs/>
+          <w:color w:val="323299"/>
+          <w:kern w:val="0"/>
+          <w:sz w:val="24"/>
+        </w:rPr>
+      </w:pPr>
+    </w:p>
+    <w:p>
+      <w:pPr>
+        <w:autoSpaceDE w:val="0"/>
+        <w:autoSpaceDN w:val="0"/>
+        <w:adjustRightInd w:val="0"/>
+        <w:ind w:firstLineChars="1500" w:firstLine="3614"/>
+        <w:rPr>
+          <w:b/>
+          <w:bCs/>
+          <w:color w:val="323299"/>
+          <w:kern w:val="0"/>
+          <w:sz w:val="24"/>
+        </w:rPr>
+      </w:pPr>
+    </w:p>
+    <w:p>
+      <w:pPr>
+        <w:autoSpaceDE w:val="0"/>
+        <w:autoSpaceDN w:val="0"/>
+        <w:adjustRightInd w:val="0"/>
+        <w:ind w:firstLineChars="1500" w:firstLine="3614"/>
+        <w:rPr>
+          <w:b/>
+          <w:bCs/>
+          <w:color w:val="323299"/>
+          <w:kern w:val="0"/>
+          <w:sz w:val="24"/>
+        </w:rPr>
+      </w:pPr>
+    </w:p>
+    <w:p>
+      <w:pPr>
+        <w:autoSpaceDE w:val="0"/>
+        <w:autoSpaceDN w:val="0"/>
+        <w:adjustRightInd w:val="0"/>
+        <w:ind w:firstLineChars="1500" w:firstLine="3614"/>
+        <w:rPr>
+          <w:b/>
+          <w:bCs/>
+          <w:color w:val="323299"/>
+          <w:kern w:val="0"/>
+          <w:sz w:val="24"/>
+        </w:rPr>
+      </w:pPr>
+    </w:p>
+    <w:p>
+      <w:pPr>
+        <w:autoSpaceDE w:val="0"/>
+        <w:autoSpaceDN w:val="0"/>
+        <w:adjustRightInd w:val="0"/>
+        <w:ind w:firstLineChars="1500" w:firstLine="3614"/>
+        <w:rPr>
+          <w:b/>
+          <w:bCs/>
+          <w:color w:val="323299"/>
+          <w:kern w:val="0"/>
+          <w:sz w:val="24"/>
+        </w:rPr>
+      </w:pPr>
+    </w:p>
+    <w:p>
+      <w:pPr>
+        <w:autoSpaceDE w:val="0"/>
+        <w:autoSpaceDN w:val="0"/>
+        <w:adjustRightInd w:val="0"/>
+        <w:ind w:firstLineChars="1500" w:firstLine="3614"/>
+        <w:rPr>
+          <w:b/>
+          <w:bCs/>
+          <w:color w:val="323299"/>
+          <w:kern w:val="0"/>
+          <w:sz w:val="24"/>
+        </w:rPr>
+      </w:pPr>
+    </w:p>
+    <w:p>
+      <w:pPr>
+        <w:autoSpaceDE w:val="0"/>
+        <w:autoSpaceDN w:val="0"/>
+        <w:adjustRightInd w:val="0"/>
+        <w:ind w:firstLineChars="1500" w:firstLine="3614"/>
+        <w:rPr>
+          <w:b/>
+          <w:bCs/>
+          <w:color w:val="323299"/>
+          <w:kern w:val="0"/>
+          <w:sz w:val="24"/>
+        </w:rPr>
+      </w:pPr>
+    </w:p>
+    <w:p>
+      <w:pPr>
+        <w:autoSpaceDE w:val="0"/>
+        <w:autoSpaceDN w:val="0"/>
+        <w:adjustRightInd w:val="0"/>
+        <w:ind w:firstLineChars="1500" w:firstLine="3614"/>
+        <w:rPr>
+          <w:b/>
+          <w:bCs/>
+          <w:color w:val="323299"/>
+          <w:kern w:val="0"/>
+          <w:sz w:val="24"/>
+        </w:rPr>
+      </w:pPr>
+    </w:p>
+    <w:p>
+      <w:pPr>
+        <w:autoSpaceDE w:val="0"/>
+        <w:autoSpaceDN w:val="0"/>
+        <w:adjustRightInd w:val="0"/>
+        <w:ind w:firstLineChars="1500" w:firstLine="3614"/>
+        <w:rPr>
+          <w:b/>
+          <w:bCs/>
+          <w:color w:val="323299"/>
+          <w:kern w:val="0"/>
+          <w:sz w:val="24"/>
+        </w:rPr>
+      </w:pPr>
+    </w:p>
+    <w:p>
+      <w:pPr>
+        <w:autoSpaceDE w:val="0"/>
+        <w:autoSpaceDN w:val="0"/>
+        <w:adjustRightInd w:val="0"/>
+        <w:ind w:firstLineChars="1500" w:firstLine="3614"/>
+        <w:rPr>
+          <w:b/>
+          <w:bCs/>
+          <w:color w:val="323299"/>
+          <w:kern w:val="0"/>
+          <w:sz w:val="24"/>
+        </w:rPr>
+      </w:pPr>
+    </w:p>
+    <w:p>
+      <w:pPr>
+        <w:autoSpaceDE w:val="0"/>
+        <w:autoSpaceDN w:val="0"/>
+        <w:adjustRightInd w:val="0"/>
+        <w:ind w:firstLineChars="1500" w:firstLine="3614"/>
+        <w:rPr>
+          <w:b/>
+          <w:bCs/>
+          <w:color w:val="323299"/>
+          <w:kern w:val="0"/>
+          <w:sz w:val="24"/>
+        </w:rPr>
+      </w:pPr>
+    </w:p>
+    <w:p>
+      <w:pPr>
+        <w:autoSpaceDE w:val="0"/>
+        <w:autoSpaceDN w:val="0"/>
+        <w:adjustRightInd w:val="0"/>
+        <w:rPr>
+          <w:b/>
+          <w:bCs/>
+          <w:color w:val="323299"/>
+          <w:kern w:val="0"/>
+          <w:sz w:val="24"/>
+        </w:rPr>
+      </w:pPr>
+    </w:p>
+    <w:p>
+      <w:pPr>
+        <w:autoSpaceDE w:val="0"/>
+        <w:autoSpaceDN w:val="0"/>
+        <w:adjustRightInd w:val="0"/>
+        <w:rPr>
+          <w:b/>
+          <w:bCs/>
+          <w:color w:val="323299"/>
+          <w:kern w:val="0"/>
+          <w:sz w:val="24"/>
+        </w:rPr>
+      </w:pPr>
+    </w:p>
+    <w:p>
+      <w:pPr>
+        <w:autoSpaceDE w:val="0"/>
+        <w:autoSpaceDN w:val="0"/>
+        <w:adjustRightInd w:val="0"/>
+        <w:ind w:right="60"/>
+        <w:jc w:val="right"/>
+        <w:rPr>
+          <w:b/>
+          <w:color w:val="000000"/>
+          <w:kern w:val="0"/>
+          <w:sz w:val="24"/>
+        </w:rPr>
+      </w:pPr>
+    </w:p>
+    <w:p>
+      <w:pPr>
+        <w:autoSpaceDE w:val="0"/>
+        <w:autoSpaceDN w:val="0"/>
+        <w:adjustRightInd w:val="0"/>
+        <w:ind w:right="60"/>
+        <w:jc w:val="right"/>
+        <w:rPr>
+          <w:b/>
+          <w:color w:val="000000"/>
+          <w:kern w:val="0"/>
+          <w:sz w:val="24"/>
+        </w:rPr>
+      </w:pPr>
+    </w:p>
+    <w:p>
+      <w:pPr>
+        <w:autoSpaceDE w:val="0"/>
+        <w:autoSpaceDN w:val="0"/>
+        <w:adjustRightInd w:val="0"/>
+        <w:ind w:right="60"/>
+        <w:jc w:val="right"/>
+        <w:rPr>
+          <w:b/>
+          <w:color w:val="000000"/>
+          <w:kern w:val="0"/>
+          <w:sz w:val="24"/>
+        </w:rPr>
+      </w:pPr>
+    </w:p>
+    <w:p>
+      <w:pPr>
+        <w:autoSpaceDE w:val="0"/>
+        <w:autoSpaceDN w:val="0"/>
+        <w:adjustRightInd w:val="0"/>
+        <w:ind w:right="60"/>
+        <w:jc w:val="right"/>
+        <w:rPr>
+          <w:b/>
+          <w:color w:val="000000"/>
+          <w:kern w:val="0"/>
+          <w:sz w:val="24"/>
+        </w:rPr>
+      </w:pPr>
+    </w:p>
+    <w:p>
+      <w:pPr>
+        <w:autoSpaceDE w:val="0"/>
+        <w:autoSpaceDN w:val="0"/>
+        <w:adjustRightInd w:val="0"/>
+        <w:ind w:right="60"/>
+        <w:jc w:val="right"/>
+        <w:rPr>
+          <w:b/>
+          <w:color w:val="000000"/>
+          <w:kern w:val="0"/>
+          <w:sz w:val="24"/>
+        </w:rPr>
+      </w:pPr>
+      <w:r>
+        <w:rPr>
+          <w:rFonts w:hint="eastAsia"/>
+          <w:b/>
+          <w:color w:val="000000"/>
+          <w:kern w:val="0"/>
+          <w:sz w:val="24"/>
+        </w:rPr>
+        <w:lastRenderedPageBreak/>
+        <w:t xml:space="preserve"> </w:t>
+      </w:r>
+      <w:r>
+        <w:rPr>
+          <w:b/>
+          <w:color w:val="000000"/>
+          <w:kern w:val="0"/>
+          <w:sz w:val="24"/>
+        </w:rPr>
+        <w:t xml:space="preserve">Our </w:t>
+      </w:r>
+      <w:r>
+        <w:rPr>
+          <w:rFonts w:hint="eastAsia"/>
+          <w:b/>
+          <w:color w:val="000000"/>
+          <w:kern w:val="0"/>
+          <w:sz w:val="24"/>
+        </w:rPr>
+        <w:t>R</w:t>
+      </w:r>
+      <w:r>
+        <w:rPr>
+          <w:b/>
+          <w:color w:val="000000"/>
+          <w:kern w:val="0"/>
+          <w:sz w:val="24"/>
+        </w:rPr>
+        <w:t>ef</w:t>
+      </w:r>
+      <w:r>
+        <w:rPr>
+          <w:b/>
+          <w:color w:val="000000"/>
+          <w:kern w:val="0"/>
+          <w:sz w:val="24"/>
+        </w:rPr>
+        <w:t>:</w:t>
+      </w:r>
+      <w:r>
+        <w:t xml:space="preserve"> </w:t>
+      </w:r>
+      <w:r>
+        <w:rPr>
+          <w:b/>
+          <w:bCs/>
+          <w:color w:val="000000"/>
+          <w:shd w:val="clear" w:color="auto" w:fill="FFFFFF"/>
           <w:lang w:val="en-GB"/>
         </w:rPr>
-      </w:pPr>
-      <w:r>
-        <w:rPr>
-          <w:b/>
-          <w:bCs/>
-          <w:sz w:val="24"/>
+        <w:t>{</w:t>
+      </w:r>
+      <w:proofErr w:type="spellStart"/>
+      <w:r>
+        <w:rPr>
+          <w:b/>
+          <w:bCs/>
+          <w:color w:val="000000"/>
+          <w:shd w:val="clear" w:color="auto" w:fill="FFFFFF"/>
           <w:lang w:val="en-GB"/>
         </w:rPr>
-        <w:t>Signed_________________</w:t>
-      </w:r>
-      <w:r>
-        <w:rPr>
-          <w:b/>
-          <w:bCs/>
-          <w:sz w:val="24"/>
+        <w:t>CaseRef</w:t>
+      </w:r>
+      <w:proofErr w:type="spellEnd"/>
+      <w:r>
+        <w:rPr>
+          <w:b/>
+          <w:bCs/>
+          <w:color w:val="000000"/>
+          <w:shd w:val="clear" w:color="auto" w:fill="FFFFFF"/>
           <w:lang w:val="en-GB"/>
         </w:rPr>
-        <w:t xml:space="preserve">; Print </w:t>
-      </w:r>
-      <w:proofErr w:type="gramStart"/>
-      <w:r>
-        <w:rPr>
-          <w:b/>
-          <w:bCs/>
+        <w:t>}</w:t>
+      </w:r>
+      <w:r>
+        <w:rPr>
+          <w:b/>
+          <w:bCs/>
+          <w:color w:val="000000"/>
+          <w:shd w:val="clear" w:color="auto" w:fill="FFFFFF"/>
+        </w:rPr>
+        <w:t xml:space="preserve"> </w:t>
+      </w:r>
+      <w:r>
+        <w:rPr>
+          <w:rFonts w:hint="eastAsia"/>
+          <w:b/>
+          <w:bCs/>
+          <w:color w:val="000000"/>
+          <w:shd w:val="clear" w:color="auto" w:fill="FFFFFF"/>
+        </w:rPr>
+        <w:t xml:space="preserve">          </w:t>
+      </w:r>
+    </w:p>
+    <w:p>
+      <w:pPr>
+        <w:autoSpaceDE w:val="0"/>
+        <w:autoSpaceDN w:val="0"/>
+        <w:adjustRightInd w:val="0"/>
+        <w:ind w:firstLineChars="3300" w:firstLine="7951"/>
+        <w:rPr>
+          <w:b/>
+          <w:color w:val="000000"/>
+          <w:kern w:val="0"/>
+          <w:sz w:val="24"/>
+        </w:rPr>
+      </w:pPr>
+      <w:r>
+        <w:rPr>
+          <w:rFonts w:hint="eastAsia"/>
+          <w:b/>
+          <w:color w:val="000000"/>
+          <w:kern w:val="0"/>
+          <w:sz w:val="24"/>
+        </w:rPr>
+        <w:t>Date:</w:t>
+      </w:r>
+      <w:r>
+        <w:rPr>
+          <w:rFonts w:hint="eastAsia"/>
+          <w:b/>
+          <w:color w:val="000000"/>
+          <w:kern w:val="0"/>
+          <w:sz w:val="24"/>
+        </w:rPr>
+        <w:t xml:space="preserve"> </w:t>
+      </w:r>
+      <w:r>
+        <w:rPr>
+          <w:b/>
+          <w:color w:val="000000"/>
+          <w:kern w:val="0"/>
+          <w:sz w:val="24"/>
+        </w:rPr>
+        <w:t>{Date}</w:t>
+      </w:r>
+    </w:p>
+    <w:p>
+      <w:pPr>
+        <w:autoSpaceDE w:val="0"/>
+        <w:autoSpaceDN w:val="0"/>
+        <w:adjustRightInd w:val="0"/>
+        <w:rPr>
+          <w:b/>
+          <w:color w:val="000000"/>
+          <w:kern w:val="0"/>
+          <w:sz w:val="24"/>
+        </w:rPr>
+      </w:pPr>
+    </w:p>
+    <w:p>
+      <w:pPr>
+        <w:rPr>
           <w:sz w:val="24"/>
           <w:lang w:val="en-GB"/>
         </w:rPr>
-        <w:t>Name</w:t>
-      </w:r>
-      <w:r>
-        <w:rPr>
-          <w:b/>
-          <w:bCs/>
-          <w:sz w:val="24"/>
-          <w:lang w:val="en-GB"/>
-        </w:rPr>
-        <w:t>:</w:t>
+      </w:pPr>
+      <w:r>
+        <w:rPr>
+          <w:b/>
+          <w:color w:val="000000"/>
+          <w:kern w:val="0"/>
+          <w:sz w:val="24"/>
+        </w:rPr>
+        <w:t>Dear</w:t>
       </w:r>
       <w:r>
         <w:rPr>
@@ -370,7 +912,7 @@
           <w:color w:val="000000" w:themeColor="text1"/>
           <w:u w:val="single"/>
         </w:rPr>
-        <w:t>{</w:t>
+        <w:t xml:space="preserve"> {</w:t>
       </w:r>
       <w:proofErr w:type="spellStart"/>
       <w:r>
@@ -395,827 +937,51 @@
       <w:r>
         <w:rPr>
           <w:rFonts w:hint="eastAsia"/>
-          <w:sz w:val="24"/>
-          <w:lang w:val="en-GB"/>
-        </w:rPr>
-        <w:t xml:space="preserve">  </w:t>
-      </w:r>
-      <w:r>
-        <w:rPr>
-          <w:b/>
-          <w:bCs/>
-          <w:sz w:val="24"/>
-          <w:lang w:val="en-GB"/>
-        </w:rPr>
-        <w:t>Date</w:t>
-      </w:r>
-      <w:proofErr w:type="gramEnd"/>
+          <w:b/>
+          <w:bCs/>
+          <w:sz w:val="24"/>
+        </w:rPr>
+        <w:t>，</w:t>
+      </w:r>
       <w:r>
         <w:rPr>
           <w:rFonts w:hint="eastAsia"/>
           <w:b/>
           <w:bCs/>
           <w:sz w:val="24"/>
-          <w:lang w:val="en-GB"/>
-        </w:rPr>
-        <w:t>:</w:t>
-      </w:r>
-      <w:r>
-        <w:rPr>
-          <w:rFonts w:hint="eastAsia"/>
-          <w:b/>
-          <w:bCs/>
-          <w:sz w:val="24"/>
-          <w:lang w:val="en-GB"/>
         </w:rPr>
         <w:t xml:space="preserve"> </w:t>
       </w:r>
-      <w:r>
-        <w:rPr>
-          <w:b/>
-          <w:bCs/>
-          <w:sz w:val="24"/>
-          <w:u w:val="single"/>
-          <w:lang w:val="en-GB"/>
-        </w:rPr>
-        <w:t>{Date}</w:t>
-      </w:r>
-    </w:p>
-    <w:p>
-      <w:pPr>
-        <w:autoSpaceDE w:val="0"/>
-        <w:autoSpaceDN w:val="0"/>
-        <w:adjustRightInd w:val="0"/>
-        <w:rPr>
-          <w:b/>
-          <w:bCs/>
-          <w:color w:val="323299"/>
-          <w:kern w:val="0"/>
-          <w:sz w:val="24"/>
-          <w:lang w:val="en-GB"/>
-        </w:rPr>
-      </w:pPr>
-    </w:p>
-    <w:p>
-      <w:pPr>
-        <w:autoSpaceDE w:val="0"/>
-        <w:autoSpaceDN w:val="0"/>
-        <w:adjustRightInd w:val="0"/>
-        <w:ind w:firstLineChars="1500" w:firstLine="3614"/>
-        <w:rPr>
-          <w:b/>
-          <w:bCs/>
-          <w:color w:val="323299"/>
-          <w:kern w:val="0"/>
-          <w:sz w:val="24"/>
-          <w:lang w:val="en-GB"/>
-        </w:rPr>
-      </w:pPr>
-    </w:p>
-    <w:p>
-      <w:pPr>
-        <w:autoSpaceDE w:val="0"/>
-        <w:autoSpaceDN w:val="0"/>
-        <w:adjustRightInd w:val="0"/>
-        <w:ind w:firstLineChars="1500" w:firstLine="3614"/>
-        <w:rPr>
-          <w:b/>
-          <w:bCs/>
-          <w:color w:val="323299"/>
-          <w:kern w:val="0"/>
-          <w:sz w:val="24"/>
-          <w:lang w:val="en-GB"/>
-        </w:rPr>
-      </w:pPr>
-    </w:p>
-    <w:p>
-      <w:pPr>
-        <w:autoSpaceDE w:val="0"/>
-        <w:autoSpaceDN w:val="0"/>
-        <w:adjustRightInd w:val="0"/>
-        <w:ind w:firstLineChars="1500" w:firstLine="3614"/>
-        <w:rPr>
-          <w:b/>
-          <w:bCs/>
-          <w:color w:val="323299"/>
-          <w:kern w:val="0"/>
-          <w:sz w:val="24"/>
-          <w:lang w:val="en-GB"/>
-        </w:rPr>
-      </w:pPr>
-    </w:p>
-    <w:p>
-      <w:pPr>
-        <w:autoSpaceDE w:val="0"/>
-        <w:autoSpaceDN w:val="0"/>
-        <w:adjustRightInd w:val="0"/>
-        <w:ind w:firstLineChars="1500" w:firstLine="3614"/>
-        <w:rPr>
-          <w:b/>
-          <w:bCs/>
-          <w:color w:val="323299"/>
-          <w:kern w:val="0"/>
-          <w:sz w:val="24"/>
-        </w:rPr>
-      </w:pPr>
-    </w:p>
-    <w:p>
-      <w:pPr>
-        <w:autoSpaceDE w:val="0"/>
-        <w:autoSpaceDN w:val="0"/>
-        <w:adjustRightInd w:val="0"/>
-        <w:ind w:firstLineChars="1500" w:firstLine="3614"/>
-        <w:rPr>
-          <w:b/>
-          <w:bCs/>
-          <w:color w:val="323299"/>
-          <w:kern w:val="0"/>
-          <w:sz w:val="24"/>
-        </w:rPr>
-      </w:pPr>
-    </w:p>
-    <w:p>
-      <w:pPr>
-        <w:autoSpaceDE w:val="0"/>
-        <w:autoSpaceDN w:val="0"/>
-        <w:adjustRightInd w:val="0"/>
-        <w:ind w:firstLineChars="1500" w:firstLine="3614"/>
-        <w:rPr>
-          <w:b/>
-          <w:bCs/>
-          <w:color w:val="323299"/>
-          <w:kern w:val="0"/>
-          <w:sz w:val="24"/>
-        </w:rPr>
-      </w:pPr>
-    </w:p>
-    <w:p>
-      <w:pPr>
-        <w:autoSpaceDE w:val="0"/>
-        <w:autoSpaceDN w:val="0"/>
-        <w:adjustRightInd w:val="0"/>
-        <w:ind w:firstLineChars="1500" w:firstLine="3614"/>
-        <w:rPr>
-          <w:b/>
-          <w:bCs/>
-          <w:color w:val="323299"/>
-          <w:kern w:val="0"/>
-          <w:sz w:val="24"/>
-        </w:rPr>
-      </w:pPr>
-    </w:p>
-    <w:p>
-      <w:pPr>
-        <w:autoSpaceDE w:val="0"/>
-        <w:autoSpaceDN w:val="0"/>
-        <w:adjustRightInd w:val="0"/>
-        <w:ind w:firstLineChars="1500" w:firstLine="3614"/>
-        <w:rPr>
-          <w:b/>
-          <w:bCs/>
-          <w:color w:val="323299"/>
-          <w:kern w:val="0"/>
-          <w:sz w:val="24"/>
-        </w:rPr>
-      </w:pPr>
-    </w:p>
-    <w:p>
-      <w:pPr>
-        <w:autoSpaceDE w:val="0"/>
-        <w:autoSpaceDN w:val="0"/>
-        <w:adjustRightInd w:val="0"/>
-        <w:ind w:firstLineChars="1500" w:firstLine="3614"/>
-        <w:rPr>
-          <w:b/>
-          <w:bCs/>
-          <w:color w:val="323299"/>
-          <w:kern w:val="0"/>
-          <w:sz w:val="24"/>
-        </w:rPr>
-      </w:pPr>
-    </w:p>
-    <w:p>
-      <w:pPr>
-        <w:autoSpaceDE w:val="0"/>
-        <w:autoSpaceDN w:val="0"/>
-        <w:adjustRightInd w:val="0"/>
-        <w:ind w:firstLineChars="1500" w:firstLine="3614"/>
-        <w:rPr>
-          <w:b/>
-          <w:bCs/>
-          <w:color w:val="323299"/>
-          <w:kern w:val="0"/>
-          <w:sz w:val="24"/>
-        </w:rPr>
-      </w:pPr>
-    </w:p>
-    <w:p>
-      <w:pPr>
-        <w:autoSpaceDE w:val="0"/>
-        <w:autoSpaceDN w:val="0"/>
-        <w:adjustRightInd w:val="0"/>
-        <w:ind w:firstLineChars="1500" w:firstLine="3614"/>
-        <w:rPr>
-          <w:b/>
-          <w:bCs/>
-          <w:color w:val="323299"/>
-          <w:kern w:val="0"/>
-          <w:sz w:val="24"/>
-        </w:rPr>
-      </w:pPr>
-    </w:p>
-    <w:p>
-      <w:pPr>
-        <w:autoSpaceDE w:val="0"/>
-        <w:autoSpaceDN w:val="0"/>
-        <w:adjustRightInd w:val="0"/>
-        <w:ind w:firstLineChars="1500" w:firstLine="3614"/>
-        <w:rPr>
-          <w:b/>
-          <w:bCs/>
-          <w:color w:val="323299"/>
-          <w:kern w:val="0"/>
-          <w:sz w:val="24"/>
-        </w:rPr>
-      </w:pPr>
-    </w:p>
-    <w:p>
-      <w:pPr>
-        <w:autoSpaceDE w:val="0"/>
-        <w:autoSpaceDN w:val="0"/>
-        <w:adjustRightInd w:val="0"/>
-        <w:ind w:firstLineChars="1500" w:firstLine="3614"/>
-        <w:rPr>
-          <w:b/>
-          <w:bCs/>
-          <w:color w:val="323299"/>
-          <w:kern w:val="0"/>
-          <w:sz w:val="24"/>
-        </w:rPr>
-      </w:pPr>
-    </w:p>
-    <w:p>
-      <w:pPr>
-        <w:autoSpaceDE w:val="0"/>
-        <w:autoSpaceDN w:val="0"/>
-        <w:adjustRightInd w:val="0"/>
-        <w:ind w:firstLineChars="1500" w:firstLine="3614"/>
-        <w:rPr>
-          <w:b/>
-          <w:bCs/>
-          <w:color w:val="323299"/>
-          <w:kern w:val="0"/>
-          <w:sz w:val="24"/>
-        </w:rPr>
-      </w:pPr>
-    </w:p>
-    <w:p>
-      <w:pPr>
-        <w:autoSpaceDE w:val="0"/>
-        <w:autoSpaceDN w:val="0"/>
-        <w:adjustRightInd w:val="0"/>
-        <w:rPr>
-          <w:b/>
-          <w:bCs/>
-          <w:color w:val="323299"/>
-          <w:kern w:val="0"/>
-          <w:sz w:val="24"/>
-        </w:rPr>
-      </w:pPr>
-    </w:p>
-    <w:p>
-      <w:pPr>
-        <w:autoSpaceDE w:val="0"/>
-        <w:autoSpaceDN w:val="0"/>
-        <w:adjustRightInd w:val="0"/>
-        <w:rPr>
-          <w:b/>
-          <w:bCs/>
-          <w:color w:val="323299"/>
-          <w:kern w:val="0"/>
-          <w:sz w:val="24"/>
-        </w:rPr>
-      </w:pPr>
-    </w:p>
-    <w:p>
-      <w:pPr>
-        <w:autoSpaceDE w:val="0"/>
-        <w:autoSpaceDN w:val="0"/>
-        <w:adjustRightInd w:val="0"/>
-        <w:ind w:right="60"/>
-        <w:jc w:val="right"/>
-        <w:rPr>
-          <w:b/>
-          <w:color w:val="000000"/>
-          <w:kern w:val="0"/>
-          <w:sz w:val="24"/>
-        </w:rPr>
-      </w:pPr>
-    </w:p>
-    <w:p>
-      <w:pPr>
-        <w:autoSpaceDE w:val="0"/>
-        <w:autoSpaceDN w:val="0"/>
-        <w:adjustRightInd w:val="0"/>
-        <w:ind w:right="60"/>
-        <w:jc w:val="right"/>
-        <w:rPr>
-          <w:b/>
-          <w:color w:val="000000"/>
-          <w:kern w:val="0"/>
-          <w:sz w:val="24"/>
-        </w:rPr>
-      </w:pPr>
-    </w:p>
-    <w:p>
-      <w:pPr>
-        <w:autoSpaceDE w:val="0"/>
-        <w:autoSpaceDN w:val="0"/>
-        <w:adjustRightInd w:val="0"/>
-        <w:ind w:right="60"/>
-        <w:jc w:val="right"/>
-        <w:rPr>
-          <w:b/>
-          <w:color w:val="000000"/>
-          <w:kern w:val="0"/>
-          <w:sz w:val="24"/>
-        </w:rPr>
-      </w:pPr>
-    </w:p>
-    <w:p>
-      <w:pPr>
-        <w:autoSpaceDE w:val="0"/>
-        <w:autoSpaceDN w:val="0"/>
-        <w:adjustRightInd w:val="0"/>
-        <w:ind w:right="60"/>
-        <w:jc w:val="right"/>
-        <w:rPr>
-          <w:b/>
-          <w:color w:val="000000"/>
-          <w:kern w:val="0"/>
-          <w:sz w:val="24"/>
-        </w:rPr>
-      </w:pPr>
-    </w:p>
-    <w:p>
-      <w:pPr>
-        <w:autoSpaceDE w:val="0"/>
-        <w:autoSpaceDN w:val="0"/>
-        <w:adjustRightInd w:val="0"/>
-        <w:ind w:right="60"/>
-        <w:jc w:val="right"/>
-        <w:rPr>
-          <w:b/>
-          <w:color w:val="000000"/>
-          <w:kern w:val="0"/>
-          <w:sz w:val="24"/>
-        </w:rPr>
-      </w:pPr>
-      <w:r>
-        <w:rPr>
-          <w:rFonts w:hint="eastAsia"/>
-          <w:b/>
-          <w:color w:val="000000"/>
-          <w:kern w:val="0"/>
-          <w:sz w:val="24"/>
-        </w:rPr>
-        <w:lastRenderedPageBreak/>
-        <w:t xml:space="preserve"> </w:t>
-      </w:r>
-      <w:r>
-        <w:rPr>
-          <w:b/>
-          <w:color w:val="000000"/>
-          <w:kern w:val="0"/>
-          <w:sz w:val="24"/>
-        </w:rPr>
-        <w:t xml:space="preserve">Our </w:t>
-      </w:r>
-      <w:r>
-        <w:rPr>
-          <w:rFonts w:hint="eastAsia"/>
-          <w:b/>
-          <w:color w:val="000000"/>
-          <w:kern w:val="0"/>
-          <w:sz w:val="24"/>
-        </w:rPr>
-        <w:t>R</w:t>
-      </w:r>
-      <w:r>
-        <w:rPr>
-          <w:b/>
-          <w:color w:val="000000"/>
-          <w:kern w:val="0"/>
-          <w:sz w:val="24"/>
-        </w:rPr>
-        <w:t>ef</w:t>
-      </w:r>
-      <w:r>
-        <w:rPr>
-          <w:b/>
-          <w:color w:val="000000"/>
-          <w:kern w:val="0"/>
-          <w:sz w:val="24"/>
-        </w:rPr>
-        <w:t>:</w:t>
-      </w:r>
-      <w:r>
-        <w:t xml:space="preserve"> </w:t>
-      </w:r>
-      <w:r>
-        <w:rPr>
-          <w:b/>
-          <w:bCs/>
-          <w:color w:val="000000"/>
-          <w:shd w:val="clear" w:color="auto" w:fill="FFFFFF"/>
-          <w:lang w:val="en-GB"/>
-        </w:rPr>
-        <w:t>{</w:t>
-      </w:r>
-      <w:proofErr w:type="spellStart"/>
-      <w:r>
-        <w:rPr>
-          <w:b/>
-          <w:bCs/>
-          <w:color w:val="000000"/>
-          <w:shd w:val="clear" w:color="auto" w:fill="FFFFFF"/>
-          <w:lang w:val="en-GB"/>
-        </w:rPr>
-        <w:t>CaseRef</w:t>
-      </w:r>
-      <w:proofErr w:type="spellEnd"/>
-      <w:r>
-        <w:rPr>
-          <w:b/>
-          <w:bCs/>
-          <w:color w:val="000000"/>
-          <w:shd w:val="clear" w:color="auto" w:fill="FFFFFF"/>
-          <w:lang w:val="en-GB"/>
-        </w:rPr>
-        <w:t>}</w:t>
-      </w:r>
-      <w:r>
-        <w:rPr>
-          <w:b/>
-          <w:bCs/>
-          <w:color w:val="000000"/>
-          <w:shd w:val="clear" w:color="auto" w:fill="FFFFFF"/>
-        </w:rPr>
-        <w:t xml:space="preserve"> </w:t>
-      </w:r>
-      <w:r>
-        <w:rPr>
-          <w:rFonts w:hint="eastAsia"/>
-          <w:b/>
-          <w:bCs/>
-          <w:color w:val="000000"/>
-          <w:shd w:val="clear" w:color="auto" w:fill="FFFFFF"/>
-        </w:rPr>
-        <w:t xml:space="preserve">          </w:t>
-      </w:r>
-    </w:p>
-    <w:p>
-      <w:pPr>
-        <w:autoSpaceDE w:val="0"/>
-        <w:autoSpaceDN w:val="0"/>
-        <w:adjustRightInd w:val="0"/>
-        <w:ind w:firstLineChars="3300" w:firstLine="7951"/>
-        <w:rPr>
-          <w:b/>
-          <w:color w:val="000000"/>
-          <w:kern w:val="0"/>
-          <w:sz w:val="24"/>
-        </w:rPr>
-      </w:pPr>
-      <w:r>
-        <w:rPr>
-          <w:rFonts w:hint="eastAsia"/>
-          <w:b/>
-          <w:color w:val="000000"/>
-          <w:kern w:val="0"/>
-          <w:sz w:val="24"/>
-        </w:rPr>
-        <w:t>Date:</w:t>
-      </w:r>
-      <w:r>
-        <w:rPr>
-          <w:rFonts w:hint="eastAsia"/>
-          <w:b/>
-          <w:color w:val="000000"/>
-          <w:kern w:val="0"/>
-          <w:sz w:val="24"/>
-        </w:rPr>
-        <w:t xml:space="preserve"> </w:t>
-      </w:r>
-      <w:r>
-        <w:rPr>
-          <w:b/>
-          <w:color w:val="000000"/>
-          <w:kern w:val="0"/>
-          <w:sz w:val="24"/>
-        </w:rPr>
-        <w:t>{Date}</w:t>
-      </w:r>
-    </w:p>
-    <w:p>
-      <w:pPr>
-        <w:autoSpaceDE w:val="0"/>
-        <w:autoSpaceDN w:val="0"/>
-        <w:adjustRightInd w:val="0"/>
-        <w:rPr>
-          <w:b/>
-          <w:color w:val="000000"/>
-          <w:kern w:val="0"/>
-          <w:sz w:val="24"/>
-        </w:rPr>
-      </w:pPr>
-    </w:p>
-    <w:p>
-      <w:pPr>
-        <w:rPr>
-          <w:sz w:val="24"/>
-          <w:lang w:val="en-GB"/>
-        </w:rPr>
-      </w:pPr>
-      <w:r>
-        <w:rPr>
-          <w:b/>
-          <w:color w:val="000000"/>
-          <w:kern w:val="0"/>
-          <w:sz w:val="24"/>
-        </w:rPr>
-        <w:t>Dear</w:t>
-      </w:r>
-      <w:r>
-        <w:rPr>
-          <w:b/>
-          <w:bCs/>
-          <w:color w:val="000000" w:themeColor="text1"/>
-          <w:u w:val="single"/>
-        </w:rPr>
-        <w:t xml:space="preserve"> {</w:t>
-      </w:r>
-      <w:proofErr w:type="spellStart"/>
-      <w:r>
-        <w:rPr>
-          <w:b/>
-          <w:bCs/>
-          <w:color w:val="000000" w:themeColor="text1"/>
-          <w:u w:val="single"/>
-        </w:rPr>
-        <w:t>ClientName</w:t>
-      </w:r>
-      <w:proofErr w:type="spellEnd"/>
-      <w:r>
-        <w:rPr>
-          <w:b/>
-          <w:bCs/>
-          <w:color w:val="000000" w:themeColor="text1"/>
-          <w:u w:val="single"/>
-        </w:rPr>
-        <w:t>}</w:t>
-      </w:r>
-      <w:r>
-        <w:rPr>
-          <w:rFonts w:hint="eastAsia"/>
-          <w:b/>
-          <w:bCs/>
-          <w:sz w:val="24"/>
-        </w:rPr>
-        <w:t>，</w:t>
-      </w:r>
-      <w:r>
-        <w:rPr>
-          <w:rFonts w:hint="eastAsia"/>
-          <w:b/>
-          <w:bCs/>
-          <w:sz w:val="24"/>
-        </w:rPr>
-        <w:t xml:space="preserve"> </w:t>
-      </w:r>
-    </w:p>
-    <w:p>
-      <w:pPr>
-        <w:autoSpaceDE w:val="0"/>
-        <w:autoSpaceDN w:val="0"/>
-        <w:adjustRightInd w:val="0"/>
-        <w:rPr>
-          <w:color w:val="000000"/>
-          <w:kern w:val="0"/>
-          <w:sz w:val="24"/>
-        </w:rPr>
-      </w:pPr>
-    </w:p>
-    <w:p>
-      <w:pPr>
-        <w:autoSpaceDE w:val="0"/>
-        <w:autoSpaceDN w:val="0"/>
-        <w:adjustRightInd w:val="0"/>
-        <w:rPr>
-          <w:color w:val="000000"/>
-          <w:kern w:val="0"/>
-          <w:sz w:val="24"/>
-        </w:rPr>
-      </w:pPr>
-      <w:r>
-        <w:rPr>
-          <w:color w:val="000000"/>
-          <w:kern w:val="0"/>
-          <w:sz w:val="24"/>
-        </w:rPr>
-        <w:t xml:space="preserve">Thank you for instructing Leo </w:t>
-      </w:r>
-      <w:r>
-        <w:rPr>
-          <w:rFonts w:hint="eastAsia"/>
-          <w:color w:val="000000"/>
-          <w:kern w:val="0"/>
-          <w:sz w:val="24"/>
-        </w:rPr>
-        <w:t>V</w:t>
-      </w:r>
-      <w:r>
-        <w:rPr>
-          <w:color w:val="000000"/>
-          <w:kern w:val="0"/>
-          <w:sz w:val="24"/>
-        </w:rPr>
-        <w:t xml:space="preserve">isa Service to act on </w:t>
-      </w:r>
-      <w:r>
-        <w:rPr>
-          <w:color w:val="000000"/>
-          <w:kern w:val="0"/>
-          <w:sz w:val="24"/>
-        </w:rPr>
-        <w:t xml:space="preserve">your </w:t>
-      </w:r>
-      <w:r>
-        <w:rPr>
-          <w:color w:val="000000"/>
-          <w:kern w:val="0"/>
-          <w:sz w:val="24"/>
-        </w:rPr>
-        <w:t xml:space="preserve">behalf in dealing with </w:t>
-      </w:r>
-      <w:r>
-        <w:rPr>
-          <w:rFonts w:hint="eastAsia"/>
-          <w:color w:val="000000"/>
-          <w:kern w:val="0"/>
-          <w:sz w:val="24"/>
-        </w:rPr>
-        <w:t>your</w:t>
-      </w:r>
-      <w:r>
-        <w:rPr>
-          <w:rFonts w:hint="eastAsia"/>
-          <w:color w:val="000000"/>
-          <w:kern w:val="0"/>
-          <w:sz w:val="24"/>
-        </w:rPr>
-        <w:t xml:space="preserve"> </w:t>
-      </w:r>
-      <w:r>
-        <w:rPr>
-          <w:color w:val="000000"/>
-          <w:kern w:val="0"/>
-          <w:sz w:val="24"/>
-        </w:rPr>
-        <w:t xml:space="preserve">visa </w:t>
-      </w:r>
-      <w:r>
-        <w:rPr>
-          <w:kern w:val="0"/>
-          <w:sz w:val="24"/>
-        </w:rPr>
-        <w:t>application</w:t>
-      </w:r>
-      <w:r>
-        <w:rPr>
-          <w:color w:val="000000"/>
-          <w:kern w:val="0"/>
-          <w:sz w:val="24"/>
-        </w:rPr>
-        <w:t>. We are authorized by the Office of the Immigration Services Commissioner (OISC) to provide immigration advice and services</w:t>
-      </w:r>
-      <w:r>
-        <w:rPr>
-          <w:rFonts w:hint="eastAsia"/>
-          <w:color w:val="000000"/>
-          <w:kern w:val="0"/>
-          <w:sz w:val="24"/>
-        </w:rPr>
-        <w:t xml:space="preserve"> </w:t>
-      </w:r>
-      <w:r>
-        <w:rPr>
-          <w:color w:val="000000"/>
-          <w:kern w:val="0"/>
-          <w:sz w:val="24"/>
-        </w:rPr>
-        <w:t>in</w:t>
-      </w:r>
-      <w:r>
-        <w:rPr>
-          <w:rFonts w:hint="eastAsia"/>
-          <w:color w:val="000000"/>
-          <w:kern w:val="0"/>
-          <w:sz w:val="24"/>
-        </w:rPr>
-        <w:t xml:space="preserve"> all Level </w:t>
-      </w:r>
-      <w:r>
-        <w:rPr>
-          <w:color w:val="000000"/>
-          <w:kern w:val="0"/>
-          <w:sz w:val="24"/>
-        </w:rPr>
-        <w:t>O</w:t>
-      </w:r>
-      <w:r>
-        <w:rPr>
-          <w:rFonts w:hint="eastAsia"/>
-          <w:color w:val="000000"/>
-          <w:kern w:val="0"/>
-          <w:sz w:val="24"/>
-        </w:rPr>
-        <w:t>ne</w:t>
-      </w:r>
-      <w:r>
-        <w:rPr>
-          <w:rFonts w:hint="eastAsia"/>
-          <w:color w:val="000000"/>
-          <w:kern w:val="0"/>
-          <w:sz w:val="24"/>
-        </w:rPr>
-        <w:t xml:space="preserve"> </w:t>
-      </w:r>
-      <w:r>
-        <w:rPr>
-          <w:color w:val="000000"/>
-          <w:kern w:val="0"/>
-          <w:sz w:val="24"/>
-        </w:rPr>
-        <w:t>category</w:t>
-      </w:r>
-      <w:r>
-        <w:rPr>
-          <w:color w:val="000000"/>
-          <w:kern w:val="0"/>
-          <w:sz w:val="24"/>
-        </w:rPr>
-        <w:t xml:space="preserve">. Our </w:t>
-      </w:r>
-      <w:r>
-        <w:rPr>
-          <w:color w:val="000000"/>
-          <w:kern w:val="0"/>
-          <w:sz w:val="24"/>
-        </w:rPr>
-        <w:t xml:space="preserve">registration number </w:t>
-      </w:r>
-      <w:r>
-        <w:rPr>
-          <w:color w:val="000000"/>
-          <w:kern w:val="0"/>
-          <w:sz w:val="24"/>
-        </w:rPr>
-        <w:t>is</w:t>
-      </w:r>
-      <w:r>
-        <w:rPr>
-          <w:rFonts w:hint="eastAsia"/>
-          <w:color w:val="000000"/>
-          <w:kern w:val="0"/>
-          <w:sz w:val="24"/>
-        </w:rPr>
-        <w:t xml:space="preserve"> </w:t>
-      </w:r>
-      <w:r>
-        <w:rPr>
-          <w:color w:val="000000"/>
-          <w:kern w:val="0"/>
-          <w:sz w:val="24"/>
-        </w:rPr>
-        <w:t>F2011</w:t>
-      </w:r>
-      <w:r>
-        <w:rPr>
-          <w:rFonts w:hint="eastAsia"/>
-          <w:color w:val="000000"/>
-          <w:kern w:val="0"/>
-          <w:sz w:val="24"/>
-        </w:rPr>
-        <w:t>00372</w:t>
-      </w:r>
-      <w:r>
-        <w:rPr>
-          <w:color w:val="000000"/>
-          <w:kern w:val="0"/>
-          <w:sz w:val="24"/>
-        </w:rPr>
-        <w:t>.</w:t>
+    </w:p>
+    <w:p>
+      <w:pPr>
+        <w:autoSpaceDE w:val="0"/>
+        <w:autoSpaceDN w:val="0"/>
+        <w:adjustRightInd w:val="0"/>
+        <w:rPr>
+          <w:color w:val="000000"/>
+          <w:kern w:val="0"/>
+          <w:sz w:val="24"/>
+        </w:rPr>
+      </w:pPr>
+    </w:p>
+    <w:p>
+      <w:pPr>
+        <w:autoSpaceDE w:val="0"/>
+        <w:autoSpaceDN w:val="0"/>
+        <w:adjustRightInd w:val="0"/>
+        <w:rPr>
+          <w:color w:val="000000"/>
+          <w:kern w:val="0"/>
+          <w:sz w:val="24"/>
+        </w:rPr>
+      </w:pPr>
+      <w:r>
+        <w:rPr>
+          <w:rFonts w:ascii="Times New Roman" w:hAnsi="Times New Roman"/>
+          <w:sz w:val="24"/>
+        </w:rPr>
+        <w:t>Thank you for instructing Leo Visa Service to act on your behalf in dealing with your application. We are authorised by the Immigration Advice Authority (IAA) to provide immigration advice and services at Level 1. Our registration number is F201100372.</w:t>
       </w:r>
     </w:p>
     <w:p>
@@ -3341,19 +3107,10 @@
       </w:pPr>
       <w:r>
         <w:rPr>
-          <w:color w:val="000000"/>
-          <w:kern w:val="0"/>
-          <w:sz w:val="24"/>
-        </w:rPr>
-        <w:t>In accordance with OISC requirements, we</w:t>
-      </w:r>
-      <w:r>
-        <w:rPr>
-          <w:color w:val="000000"/>
-          <w:kern w:val="0"/>
-          <w:sz w:val="24"/>
-        </w:rPr>
-        <w:t xml:space="preserve"> have Professional Indemnity Insurance (PII). The purpose of PII is to cover any compensation we may need to pay to correct a mistake or cover any legal costs due to negligence, misrepresentation and/or inaccurate advice which may cause, or contribute to, financial or other loss to the client. </w:t>
+          <w:rFonts w:ascii="Times New Roman" w:hAnsi="Times New Roman"/>
+          <w:sz w:val="24"/>
+        </w:rPr>
+        <w:t>In accordance with the requirements of the Immigration Advice Authority (IAA), we have Professional Indemnity Insurance (PII). The purpose of PII is to cover any compensation we may need to pay to correct a mistake or cover any legal costs due to negligence, misrepresentation and/or inaccurate advice which may cause, or contribute to, financial or other loss to the client.</w:t>
       </w:r>
     </w:p>
     <w:p>
@@ -3403,45 +3160,10 @@
       </w:pPr>
       <w:r>
         <w:rPr>
-          <w:color w:val="000000"/>
-          <w:kern w:val="0"/>
-          <w:sz w:val="24"/>
-        </w:rPr>
-        <w:t>The OISC requires us to keep a copy of your case file for up to 6 years after your case is closed. After that this maybe destroy</w:t>
-      </w:r>
-      <w:r>
-        <w:rPr>
-          <w:color w:val="000000"/>
-          <w:kern w:val="0"/>
-          <w:sz w:val="24"/>
-        </w:rPr>
-        <w:t xml:space="preserve">ed, unless you </w:t>
-      </w:r>
-      <w:proofErr w:type="gramStart"/>
-      <w:r>
-        <w:rPr>
-          <w:color w:val="000000"/>
-          <w:kern w:val="0"/>
-          <w:sz w:val="24"/>
-        </w:rPr>
-        <w:t>make arrangement</w:t>
-      </w:r>
-      <w:r>
-        <w:rPr>
-          <w:color w:val="000000"/>
-          <w:kern w:val="0"/>
-          <w:sz w:val="24"/>
-        </w:rPr>
-        <w:t>s</w:t>
-      </w:r>
-      <w:proofErr w:type="gramEnd"/>
-      <w:r>
-        <w:rPr>
-          <w:color w:val="000000"/>
-          <w:kern w:val="0"/>
-          <w:sz w:val="24"/>
-        </w:rPr>
-        <w:t xml:space="preserve"> to collect it from us thereafter. </w:t>
+          <w:rFonts w:ascii="Times New Roman" w:hAnsi="Times New Roman"/>
+          <w:sz w:val="24"/>
+        </w:rPr>
+        <w:t>The Immigration Advice Authority (IAA) requires us to keep a copy of your case file for up to 6 years after your case is closed. After that, it may be destroyed unless you make arrangements to collect it from us.</w:t>
       </w:r>
     </w:p>
     <w:p>
@@ -3491,44 +3213,10 @@
       </w:pPr>
       <w:r>
         <w:rPr>
-          <w:color w:val="000000"/>
-          <w:kern w:val="0"/>
-          <w:sz w:val="24"/>
-        </w:rPr>
-        <w:t>If at any stage you have any concerns regarding the conduct of your case, please raise them with me, preferably in writing. Please let me know if you would like full details of our complaint</w:t>
-      </w:r>
-      <w:r>
-        <w:rPr>
-          <w:color w:val="000000"/>
-          <w:kern w:val="0"/>
-          <w:sz w:val="24"/>
-        </w:rPr>
-        <w:t>’</w:t>
-      </w:r>
-      <w:r>
-        <w:rPr>
-          <w:color w:val="000000"/>
-          <w:kern w:val="0"/>
-          <w:sz w:val="24"/>
-        </w:rPr>
-        <w:t xml:space="preserve">s procedure. If we are unable to resolve matters to your satisfaction or you wish to pursue your complaint through other channels, you are entitled to contact the OISC at any time. Their address </w:t>
-      </w:r>
-      <w:r>
-        <w:rPr>
-          <w:rFonts w:hint="eastAsia"/>
-          <w:color w:val="000000"/>
-          <w:kern w:val="0"/>
-          <w:sz w:val="24"/>
-        </w:rPr>
-        <w:t>and contacts are</w:t>
-      </w:r>
-      <w:r>
-        <w:rPr>
-          <w:color w:val="000000"/>
-          <w:kern w:val="0"/>
-          <w:sz w:val="24"/>
-        </w:rPr>
-        <w:t xml:space="preserve">: </w:t>
+          <w:rFonts w:ascii="Times New Roman" w:hAnsi="Times New Roman"/>
+          <w:sz w:val="24"/>
+        </w:rPr>
+        <w:t>If at any stage you have any concerns regarding the conduct of your case, please raise them with me, preferably in writing. Please let me know if you would like full details of our complaints procedure. If we are unable to resolve matters to your satisfaction, or you wish to pursue your complaint through other channels, you are entitled to contact the Immigration Advice Authority (IAA) at any time. Its address is:</w:t>
       </w:r>
     </w:p>
     <w:p>
@@ -3552,60 +3240,20 @@
       </w:pPr>
       <w:r>
         <w:rPr>
-          <w:rFonts w:ascii="Times New Roman" w:hAnsi="Times New Roman" w:cs="Times New Roman"/>
-          <w:bCs/>
-        </w:rPr>
-        <w:t>The Office of the Immigration Services Commissioner</w:t>
-      </w:r>
-      <w:r>
-        <w:rPr>
-          <w:rFonts w:ascii="Times New Roman" w:hAnsi="Times New Roman" w:cs="Times New Roman"/>
-          <w:bCs/>
-        </w:rPr>
+          <w:rFonts w:ascii="Times New Roman" w:hAnsi="Times New Roman"/>
+          <w:sz w:val="24"/>
+        </w:rPr>
+        <w:t>Immigration Advice Authority</w:t>
         <w:br/>
-        <w:t>5th Floor,</w:t>
-      </w:r>
-      <w:r>
-        <w:rPr>
-          <w:rFonts w:ascii="Times New Roman" w:hAnsi="Times New Roman" w:cs="Times New Roman" w:hint="eastAsia"/>
-          <w:bCs/>
-        </w:rPr>
-        <w:t xml:space="preserve"> </w:t>
-      </w:r>
-      <w:r>
-        <w:rPr>
-          <w:rFonts w:ascii="Times New Roman" w:hAnsi="Times New Roman" w:cs="Times New Roman"/>
-          <w:bCs/>
-        </w:rPr>
-        <w:t>21 Bloomsbury Street,</w:t>
-      </w:r>
-      <w:r>
-        <w:rPr>
-          <w:rFonts w:ascii="Times New Roman" w:hAnsi="Times New Roman" w:cs="Times New Roman" w:hint="eastAsia"/>
-          <w:bCs/>
-        </w:rPr>
-        <w:t xml:space="preserve"> </w:t>
-      </w:r>
-      <w:r>
-        <w:rPr>
-          <w:rFonts w:ascii="Times New Roman" w:hAnsi="Times New Roman" w:cs="Times New Roman"/>
-          <w:bCs/>
-        </w:rPr>
-        <w:t>London</w:t>
-      </w:r>
-      <w:r>
-        <w:rPr>
-          <w:rFonts w:ascii="Times New Roman" w:hAnsi="Times New Roman" w:cs="Times New Roman" w:hint="eastAsia"/>
-          <w:bCs/>
-        </w:rPr>
-        <w:t xml:space="preserve">, </w:t>
-      </w:r>
-      <w:r>
-        <w:rPr>
-          <w:rFonts w:ascii="Times New Roman" w:hAnsi="Times New Roman" w:cs="Times New Roman"/>
-          <w:bCs/>
-        </w:rPr>
-        <w:t>WC1B 3HF</w:t>
+        <w:t>PO BOX 567</w:t>
+        <w:br/>
+        <w:t>Dartford</w:t>
+        <w:br/>
+        <w:t>Kent</w:t>
+        <w:br/>
+        <w:t>DA1 9WX</w:t>
+        <w:br/>
+        <w:t>United Kingdom</w:t>
       </w:r>
     </w:p>
     <w:p>
@@ -3617,74 +3265,37 @@
           <w:bCs/>
         </w:rPr>
       </w:pPr>
-      <w:r>
-        <w:rPr>
-          <w:rFonts w:ascii="Times New Roman" w:hAnsi="Times New Roman" w:cs="Times New Roman"/>
-          <w:bCs/>
-        </w:rPr>
-        <w:t>Telephone: 0207 211 1500</w:t>
-      </w:r>
-      <w:r>
-        <w:rPr>
-          <w:rFonts w:ascii="Times New Roman" w:hAnsi="Times New Roman" w:cs="Times New Roman"/>
-          <w:bCs/>
-        </w:rPr>
-        <w:t xml:space="preserve">    </w:t>
-      </w:r>
-      <w:r>
-        <w:rPr>
-          <w:rFonts w:ascii="Times New Roman" w:hAnsi="Times New Roman" w:cs="Times New Roman"/>
-          <w:bCs/>
-        </w:rPr>
-        <w:t>Fax: 020 7211 1553</w:t>
-      </w:r>
-    </w:p>
-    <w:p>
-      <w:pPr>
-        <w:autoSpaceDE w:val="0"/>
-        <w:autoSpaceDN w:val="0"/>
-        <w:adjustRightInd w:val="0"/>
-        <w:rPr>
-          <w:color w:val="000000"/>
-          <w:kern w:val="0"/>
-          <w:sz w:val="24"/>
-        </w:rPr>
-      </w:pPr>
-    </w:p>
-    <w:p>
-      <w:pPr>
-        <w:autoSpaceDE w:val="0"/>
-        <w:autoSpaceDN w:val="0"/>
-        <w:adjustRightInd w:val="0"/>
-        <w:rPr>
-          <w:color w:val="000000"/>
-          <w:kern w:val="0"/>
-          <w:sz w:val="24"/>
-        </w:rPr>
-      </w:pPr>
-      <w:r>
-        <w:rPr>
-          <w:color w:val="000000"/>
-          <w:kern w:val="0"/>
-          <w:sz w:val="24"/>
-        </w:rPr>
-        <w:t>The OISC is the public body</w:t>
-      </w:r>
-      <w:r>
-        <w:rPr>
-          <w:color w:val="000000"/>
-          <w:kern w:val="0"/>
-          <w:sz w:val="24"/>
-        </w:rPr>
-        <w:t xml:space="preserve"> </w:t>
-      </w:r>
-      <w:r>
-        <w:rPr>
-          <w:color w:val="000000"/>
-          <w:kern w:val="0"/>
-          <w:sz w:val="24"/>
-        </w:rPr>
-        <w:t xml:space="preserve">which regulates immigration advice and services within the UK. The OISC may review your file as part of their regulatory role. </w:t>
+      <w:r/>
+    </w:p>
+    <w:p>
+      <w:pPr>
+        <w:autoSpaceDE w:val="0"/>
+        <w:autoSpaceDN w:val="0"/>
+        <w:adjustRightInd w:val="0"/>
+        <w:rPr>
+          <w:color w:val="000000"/>
+          <w:kern w:val="0"/>
+          <w:sz w:val="24"/>
+        </w:rPr>
+      </w:pPr>
+    </w:p>
+    <w:p>
+      <w:pPr>
+        <w:autoSpaceDE w:val="0"/>
+        <w:autoSpaceDN w:val="0"/>
+        <w:adjustRightInd w:val="0"/>
+        <w:rPr>
+          <w:color w:val="000000"/>
+          <w:kern w:val="0"/>
+          <w:sz w:val="24"/>
+        </w:rPr>
+      </w:pPr>
+      <w:r>
+        <w:rPr>
+          <w:rFonts w:ascii="Times New Roman" w:hAnsi="Times New Roman"/>
+          <w:sz w:val="24"/>
+        </w:rPr>
+        <w:t>The IAA is the public body which regulates immigration advice and services within the UK. The IAA may review your file as part of its regulatory role.</w:t>
       </w:r>
     </w:p>
     <w:p>

</xml_diff>